<commit_message>
docs: alignement des versions sur 3.1.0 et correction des compteurs de tests
</commit_message>
<xml_diff>
--- a/livrables/Cahier_des_charges_v3.1.docx
+++ b/livrables/Cahier_des_charges_v3.1.docx
@@ -5003,7 +5003,7 @@
                 <w:sz w:val="20"/>
                 <w:szCs w:val="20"/>
               </w:rPr>
-              <w:t xml:space="preserve">react-native-maps + expo-location</w:t>
+              <w:t xml:space="preserve">react-native-maps (mobile), Leaflet et OpenStreetMap (web)</w:t>
             </w:r>
           </w:p>
         </w:tc>
@@ -5028,7 +5028,7 @@
                 <w:sz w:val="20"/>
                 <w:szCs w:val="20"/>
               </w:rPr>
-              <w:t xml:space="preserve">Position du livreur</w:t>
+              <w:t xml:space="preserve">Position du livreur et trajet</w:t>
             </w:r>
           </w:p>
         </w:tc>
@@ -12822,7 +12822,7 @@
                 <w:sz w:val="20"/>
                 <w:szCs w:val="20"/>
               </w:rPr>
-              <w:t xml:space="preserve">Notifications distantes non démontrables</w:t>
+              <w:t xml:space="preserve">La carte web ne suit pas le livreur en continu</w:t>
             </w:r>
           </w:p>
         </w:tc>
@@ -12848,7 +12848,7 @@
                 <w:sz w:val="20"/>
                 <w:szCs w:val="20"/>
               </w:rPr>
-              <w:t xml:space="preserve">Seul le canal local est visible en présentation</w:t>
+              <w:t xml:space="preserve">Position relevée une seule fois à l'ouverture</w:t>
             </w:r>
           </w:p>
         </w:tc>
@@ -12874,7 +12874,7 @@
                 <w:sz w:val="20"/>
                 <w:szCs w:val="20"/>
               </w:rPr>
-              <w:t xml:space="preserve">Development build EAS</w:t>
+              <w:t xml:space="preserve">Diffusion de la position par Socket.IO, comme sur mobile</w:t>
             </w:r>
           </w:p>
         </w:tc>
@@ -12901,6 +12901,84 @@
                 <w:sz w:val="20"/>
                 <w:szCs w:val="20"/>
               </w:rPr>
+              <w:t xml:space="preserve">Notifications distantes non démontrables</w:t>
+            </w:r>
+          </w:p>
+        </w:tc>
+        <w:tc>
+          <w:tcPr>
+            <w:tcW w:type="dxa" w:w="3343"/>
+            <w:tcMar>
+              <w:top w:type="dxa" w:w="80"/>
+              <w:left w:type="dxa" w:w="110"/>
+              <w:bottom w:type="dxa" w:w="80"/>
+              <w:right w:type="dxa" w:w="110"/>
+            </w:tcMar>
+          </w:tcPr>
+          <w:p>
+            <w:pPr>
+              <w:spacing w:after="0" w:line="260"/>
+            </w:pPr>
+            <w:r>
+              <w:rPr>
+                <w:b w:val="false"/>
+                <w:bCs w:val="false"/>
+                <w:sz w:val="20"/>
+                <w:szCs w:val="20"/>
+              </w:rPr>
+              <w:t xml:space="preserve">Seul le canal local est visible en présentation</w:t>
+            </w:r>
+          </w:p>
+        </w:tc>
+        <w:tc>
+          <w:tcPr>
+            <w:tcW w:type="dxa" w:w="3120"/>
+            <w:tcMar>
+              <w:top w:type="dxa" w:w="80"/>
+              <w:left w:type="dxa" w:w="110"/>
+              <w:bottom w:type="dxa" w:w="80"/>
+              <w:right w:type="dxa" w:w="110"/>
+            </w:tcMar>
+          </w:tcPr>
+          <w:p>
+            <w:pPr>
+              <w:spacing w:after="0" w:line="260"/>
+            </w:pPr>
+            <w:r>
+              <w:rPr>
+                <w:b w:val="false"/>
+                <w:bCs w:val="false"/>
+                <w:sz w:val="20"/>
+                <w:szCs w:val="20"/>
+              </w:rPr>
+              <w:t xml:space="preserve">Development build EAS</w:t>
+            </w:r>
+          </w:p>
+        </w:tc>
+      </w:tr>
+      <w:tr>
+        <w:tc>
+          <w:tcPr>
+            <w:tcW w:type="dxa" w:w="2897"/>
+            <w:shd w:fill="FBF5EC" w:color="auto" w:val="clear"/>
+            <w:tcMar>
+              <w:top w:type="dxa" w:w="80"/>
+              <w:left w:type="dxa" w:w="110"/>
+              <w:bottom w:type="dxa" w:w="80"/>
+              <w:right w:type="dxa" w:w="110"/>
+            </w:tcMar>
+          </w:tcPr>
+          <w:p>
+            <w:pPr>
+              <w:spacing w:after="0" w:line="260"/>
+            </w:pPr>
+            <w:r>
+              <w:rPr>
+                <w:b w:val="false"/>
+                <w:bCs w:val="false"/>
+                <w:sz w:val="20"/>
+                <w:szCs w:val="20"/>
+              </w:rPr>
               <w:t xml:space="preserve">Libellés de notification dupliqués</w:t>
             </w:r>
           </w:p>
@@ -12908,6 +12986,7 @@
         <w:tc>
           <w:tcPr>
             <w:tcW w:type="dxa" w:w="3343"/>
+            <w:shd w:fill="FBF5EC" w:color="auto" w:val="clear"/>
             <w:tcMar>
               <w:top w:type="dxa" w:w="80"/>
               <w:left w:type="dxa" w:w="110"/>
@@ -12933,6 +13012,7 @@
         <w:tc>
           <w:tcPr>
             <w:tcW w:type="dxa" w:w="3120"/>
+            <w:shd w:fill="FBF5EC" w:color="auto" w:val="clear"/>
             <w:tcMar>
               <w:top w:type="dxa" w:w="80"/>
               <w:left w:type="dxa" w:w="110"/>

</xml_diff>

<commit_message>
docs: livrables actualises avec le modele d'attribution des livraisons
</commit_message>
<xml_diff>
--- a/livrables/Cahier_des_charges_v3.1.docx
+++ b/livrables/Cahier_des_charges_v3.1.docx
@@ -3337,6 +3337,18 @@
       </w:pPr>
       <w:r>
         <w:t xml:space="preserve">Acceptation d'une livraison. L'attribution est atomique : si deux livreurs acceptent au même instant, un seul obtient la course.</w:t>
+      </w:r>
+    </w:p>
+    <w:p>
+      <w:pPr>
+        <w:pStyle w:val="ListParagraph"/>
+        <w:numPr>
+          <w:ilvl w:val="0"/>
+          <w:numId w:val="2"/>
+        </w:numPr>
+      </w:pPr>
+      <w:r>
+        <w:t xml:space="preserve">Le modèle est volontaire : la course est proposée à tous les livreurs connectés dès que le restaurant la marque « prête », et le premier qui accepte l'obtient. Aucun algorithme n'affecte de livreur, aucun filtrage par proximité, aucune réattribution si personne n'accepte.</w:t>
       </w:r>
     </w:p>
     <w:p>
@@ -12901,7 +12913,7 @@
                 <w:sz w:val="20"/>
                 <w:szCs w:val="20"/>
               </w:rPr>
-              <w:t xml:space="preserve">Notifications distantes non démontrables</w:t>
+              <w:t xml:space="preserve">Attribution sans proximité ni réattribution</w:t>
             </w:r>
           </w:p>
         </w:tc>
@@ -12926,7 +12938,7 @@
                 <w:sz w:val="20"/>
                 <w:szCs w:val="20"/>
               </w:rPr>
-              <w:t xml:space="preserve">Seul le canal local est visible en présentation</w:t>
+              <w:t xml:space="preserve">Une course non acceptée reste disponible sans limite de temps ; un livreur ne peut pas se désister</w:t>
             </w:r>
           </w:p>
         </w:tc>
@@ -12951,7 +12963,7 @@
                 <w:sz w:val="20"/>
                 <w:szCs w:val="20"/>
               </w:rPr>
-              <w:t xml:space="preserve">Development build EAS</w:t>
+              <w:t xml:space="preserve">Filtrage par distance, délai d'expiration, route de désistement</w:t>
             </w:r>
           </w:p>
         </w:tc>
@@ -12979,6 +12991,85 @@
                 <w:sz w:val="20"/>
                 <w:szCs w:val="20"/>
               </w:rPr>
+              <w:t xml:space="preserve">Notifications distantes non démontrables</w:t>
+            </w:r>
+          </w:p>
+        </w:tc>
+        <w:tc>
+          <w:tcPr>
+            <w:tcW w:type="dxa" w:w="3343"/>
+            <w:shd w:fill="FBF5EC" w:color="auto" w:val="clear"/>
+            <w:tcMar>
+              <w:top w:type="dxa" w:w="80"/>
+              <w:left w:type="dxa" w:w="110"/>
+              <w:bottom w:type="dxa" w:w="80"/>
+              <w:right w:type="dxa" w:w="110"/>
+            </w:tcMar>
+          </w:tcPr>
+          <w:p>
+            <w:pPr>
+              <w:spacing w:after="0" w:line="260"/>
+            </w:pPr>
+            <w:r>
+              <w:rPr>
+                <w:b w:val="false"/>
+                <w:bCs w:val="false"/>
+                <w:sz w:val="20"/>
+                <w:szCs w:val="20"/>
+              </w:rPr>
+              <w:t xml:space="preserve">Seul le canal local est visible en présentation</w:t>
+            </w:r>
+          </w:p>
+        </w:tc>
+        <w:tc>
+          <w:tcPr>
+            <w:tcW w:type="dxa" w:w="3120"/>
+            <w:shd w:fill="FBF5EC" w:color="auto" w:val="clear"/>
+            <w:tcMar>
+              <w:top w:type="dxa" w:w="80"/>
+              <w:left w:type="dxa" w:w="110"/>
+              <w:bottom w:type="dxa" w:w="80"/>
+              <w:right w:type="dxa" w:w="110"/>
+            </w:tcMar>
+          </w:tcPr>
+          <w:p>
+            <w:pPr>
+              <w:spacing w:after="0" w:line="260"/>
+            </w:pPr>
+            <w:r>
+              <w:rPr>
+                <w:b w:val="false"/>
+                <w:bCs w:val="false"/>
+                <w:sz w:val="20"/>
+                <w:szCs w:val="20"/>
+              </w:rPr>
+              <w:t xml:space="preserve">Development build EAS</w:t>
+            </w:r>
+          </w:p>
+        </w:tc>
+      </w:tr>
+      <w:tr>
+        <w:tc>
+          <w:tcPr>
+            <w:tcW w:type="dxa" w:w="2897"/>
+            <w:tcMar>
+              <w:top w:type="dxa" w:w="80"/>
+              <w:left w:type="dxa" w:w="110"/>
+              <w:bottom w:type="dxa" w:w="80"/>
+              <w:right w:type="dxa" w:w="110"/>
+            </w:tcMar>
+          </w:tcPr>
+          <w:p>
+            <w:pPr>
+              <w:spacing w:after="0" w:line="260"/>
+            </w:pPr>
+            <w:r>
+              <w:rPr>
+                <w:b w:val="false"/>
+                <w:bCs w:val="false"/>
+                <w:sz w:val="20"/>
+                <w:szCs w:val="20"/>
+              </w:rPr>
               <w:t xml:space="preserve">Libellés de notification dupliqués</w:t>
             </w:r>
           </w:p>
@@ -12986,7 +13077,6 @@
         <w:tc>
           <w:tcPr>
             <w:tcW w:type="dxa" w:w="3343"/>
-            <w:shd w:fill="FBF5EC" w:color="auto" w:val="clear"/>
             <w:tcMar>
               <w:top w:type="dxa" w:w="80"/>
               <w:left w:type="dxa" w:w="110"/>
@@ -13012,7 +13102,6 @@
         <w:tc>
           <w:tcPr>
             <w:tcW w:type="dxa" w:w="3120"/>
-            <w:shd w:fill="FBF5EC" w:color="auto" w:val="clear"/>
             <w:tcMar>
               <w:top w:type="dxa" w:w="80"/>
               <w:left w:type="dxa" w:w="110"/>

</xml_diff>